<commit_message>
Remove BCP training from study session proposal
Co-Authored-By: Claude Opus 5.5 <noreply@anthropic.com>
Claude-Session: https://claude.ai/code/session_01ASU6ETCN5Sbt1bh9wzP5YS
</commit_message>
<xml_diff>
--- a/勉強会提案書_結いのこころ.docx
+++ b/勉強会提案書_結いのこころ.docx
@@ -137,7 +137,7 @@
           <w:sz w:val="19"/>
           <w:szCs w:val="19"/>
         </w:rPr>
-        <w:t xml:space="preserve">介護の現場では、利用者さまを支える職員の皆さまご自身の生活基盤や、災害時の備えが事業継続の土台になります。医療・介護の現場経験とFPの知見を生かし、職員会議などの時間を使った</w:t>
+        <w:t xml:space="preserve">介護の現場では、利用者さまを支える職員の皆さまご自身の生活基盤の安定が、より良いケアと職員の定着の土台になります。医療・介護の現場経験とFPの知見を生かし、職員会議などの時間を使った</w:t>
       </w:r>
       <w:r>
         <w:rPr>
@@ -196,7 +196,7 @@
           <w:sz w:val="19"/>
           <w:szCs w:val="19"/>
         </w:rPr>
-        <w:t xml:space="preserve">法定研修の一部として活用可能：</w:t>
+        <w:t xml:space="preserve">職員研修の機会として活用可能：</w:t>
       </w:r>
       <w:r>
         <w:rPr>
@@ -204,7 +204,7 @@
           <w:sz w:val="19"/>
           <w:szCs w:val="19"/>
         </w:rPr>
-        <w:t xml:space="preserve">BCP（業務継続計画）の研修・訓練は介護事業所に義務付けられています。研修計画の一部に組み込めます</w:t>
+        <w:t xml:space="preserve">外部講師による研修として、研修計画や記録にも組み込めます</w:t>
       </w:r>
     </w:p>
     <w:p>
@@ -543,7 +543,7 @@
                 <w:sz w:val="19"/>
                 <w:szCs w:val="19"/>
               </w:rPr>
-              <w:t xml:space="preserve">災害に強い施設づくり：BCPと保険の基礎</w:t>
+              <w:t xml:space="preserve">介護職のためのお金の基礎講座</w:t>
             </w:r>
           </w:p>
         </w:tc>
@@ -576,7 +576,7 @@
                 <w:sz w:val="19"/>
                 <w:szCs w:val="19"/>
               </w:rPr>
-              <w:t xml:space="preserve">地震・水害時の初動、建物・設備・賠償の備えの点検ポイント</w:t>
+              <w:t xml:space="preserve">給与明細と社会保険、NISA・iDeCoの基本、もしもの時の公的保障</w:t>
             </w:r>
           </w:p>
         </w:tc>
@@ -609,7 +609,7 @@
                 <w:sz w:val="19"/>
                 <w:szCs w:val="19"/>
               </w:rPr>
-              <w:t xml:space="preserve">全職員・管理者</w:t>
+              <w:t xml:space="preserve">全職員</w:t>
             </w:r>
           </w:p>
         </w:tc>
@@ -677,7 +677,7 @@
                 <w:sz w:val="19"/>
                 <w:szCs w:val="19"/>
               </w:rPr>
-              <w:t xml:space="preserve">介護職のためのお金の基礎講座</w:t>
+              <w:t xml:space="preserve">認知症と家族のお金</w:t>
             </w:r>
           </w:p>
         </w:tc>
@@ -709,7 +709,7 @@
                 <w:sz w:val="19"/>
                 <w:szCs w:val="19"/>
               </w:rPr>
-              <w:t xml:space="preserve">給与明細と社会保険、NISA・iDeCoの基本、もしもの時の公的保障</w:t>
+              <w:t xml:space="preserve">資産凍結の仕組み、成年後見・任意後見・家族信託の違い</w:t>
             </w:r>
           </w:p>
         </w:tc>
@@ -741,7 +741,7 @@
                 <w:sz w:val="19"/>
                 <w:szCs w:val="19"/>
               </w:rPr>
-              <w:t xml:space="preserve">全職員</w:t>
+              <w:t xml:space="preserve">相談員・ケアマネジャー</w:t>
             </w:r>
           </w:p>
         </w:tc>
@@ -811,7 +811,7 @@
                 <w:sz w:val="19"/>
                 <w:szCs w:val="19"/>
               </w:rPr>
-              <w:t xml:space="preserve">認知症と家族のお金</w:t>
+              <w:t xml:space="preserve">親の介護とお金</w:t>
             </w:r>
           </w:p>
         </w:tc>
@@ -844,7 +844,7 @@
                 <w:sz w:val="19"/>
                 <w:szCs w:val="19"/>
               </w:rPr>
-              <w:t xml:space="preserve">資産凍結の仕組み、成年後見・任意後見・家族信託の違い</w:t>
+              <w:t xml:space="preserve">介護費用の目安の考え方、介護休業・公的制度の使い方</w:t>
             </w:r>
           </w:p>
         </w:tc>
@@ -858,138 +858,6 @@
               <w:right w:val="single" w:color="BFBFBF" w:sz="4"/>
             </w:tcBorders>
             <w:shd w:fill="F2F7FC" w:color="auto" w:val="clear"/>
-            <w:tcMar>
-              <w:top w:type="dxa" w:w="50"/>
-              <w:left w:type="dxa" w:w="100"/>
-              <w:bottom w:type="dxa" w:w="50"/>
-              <w:right w:type="dxa" w:w="100"/>
-            </w:tcMar>
-            <w:vAlign w:val="center"/>
-          </w:tcPr>
-          <w:p>
-            <w:pPr>
-              <w:spacing w:after="0"/>
-              <w:jc w:val="left"/>
-            </w:pPr>
-            <w:r>
-              <w:rPr>
-                <w:rFonts w:ascii="Yu Gothic" w:eastAsia="Yu Gothic" w:hAnsi="Yu Gothic"/>
-                <w:sz w:val="19"/>
-                <w:szCs w:val="19"/>
-              </w:rPr>
-              <w:t xml:space="preserve">相談員・ケアマネジャー</w:t>
-            </w:r>
-          </w:p>
-        </w:tc>
-      </w:tr>
-      <w:tr>
-        <w:tc>
-          <w:tcPr>
-            <w:tcW w:type="dxa" w:w="600"/>
-            <w:tcBorders>
-              <w:top w:val="single" w:color="BFBFBF" w:sz="4"/>
-              <w:left w:val="single" w:color="BFBFBF" w:sz="4"/>
-              <w:bottom w:val="single" w:color="BFBFBF" w:sz="4"/>
-              <w:right w:val="single" w:color="BFBFBF" w:sz="4"/>
-            </w:tcBorders>
-            <w:tcMar>
-              <w:top w:type="dxa" w:w="50"/>
-              <w:left w:type="dxa" w:w="100"/>
-              <w:bottom w:type="dxa" w:w="50"/>
-              <w:right w:type="dxa" w:w="100"/>
-            </w:tcMar>
-            <w:vAlign w:val="center"/>
-          </w:tcPr>
-          <w:p>
-            <w:pPr>
-              <w:spacing w:after="0"/>
-              <w:jc w:val="center"/>
-            </w:pPr>
-            <w:r>
-              <w:rPr>
-                <w:rFonts w:ascii="Yu Gothic" w:eastAsia="Yu Gothic" w:hAnsi="Yu Gothic"/>
-                <w:sz w:val="19"/>
-                <w:szCs w:val="19"/>
-              </w:rPr>
-              <w:t xml:space="preserve">4</w:t>
-            </w:r>
-          </w:p>
-        </w:tc>
-        <w:tc>
-          <w:tcPr>
-            <w:tcW w:type="dxa" w:w="3300"/>
-            <w:tcBorders>
-              <w:top w:val="single" w:color="BFBFBF" w:sz="4"/>
-              <w:left w:val="single" w:color="BFBFBF" w:sz="4"/>
-              <w:bottom w:val="single" w:color="BFBFBF" w:sz="4"/>
-              <w:right w:val="single" w:color="BFBFBF" w:sz="4"/>
-            </w:tcBorders>
-            <w:tcMar>
-              <w:top w:type="dxa" w:w="50"/>
-              <w:left w:type="dxa" w:w="100"/>
-              <w:bottom w:type="dxa" w:w="50"/>
-              <w:right w:type="dxa" w:w="100"/>
-            </w:tcMar>
-            <w:vAlign w:val="center"/>
-          </w:tcPr>
-          <w:p>
-            <w:pPr>
-              <w:spacing w:after="0"/>
-              <w:jc w:val="left"/>
-            </w:pPr>
-            <w:r>
-              <w:rPr>
-                <w:rFonts w:ascii="Yu Gothic" w:eastAsia="Yu Gothic" w:hAnsi="Yu Gothic"/>
-                <w:b/>
-                <w:bCs/>
-                <w:sz w:val="19"/>
-                <w:szCs w:val="19"/>
-              </w:rPr>
-              <w:t xml:space="preserve">親の介護とお金</w:t>
-            </w:r>
-          </w:p>
-        </w:tc>
-        <w:tc>
-          <w:tcPr>
-            <w:tcW w:type="dxa" w:w="4206"/>
-            <w:tcBorders>
-              <w:top w:val="single" w:color="BFBFBF" w:sz="4"/>
-              <w:left w:val="single" w:color="BFBFBF" w:sz="4"/>
-              <w:bottom w:val="single" w:color="BFBFBF" w:sz="4"/>
-              <w:right w:val="single" w:color="BFBFBF" w:sz="4"/>
-            </w:tcBorders>
-            <w:tcMar>
-              <w:top w:type="dxa" w:w="50"/>
-              <w:left w:type="dxa" w:w="100"/>
-              <w:bottom w:type="dxa" w:w="50"/>
-              <w:right w:type="dxa" w:w="100"/>
-            </w:tcMar>
-            <w:vAlign w:val="center"/>
-          </w:tcPr>
-          <w:p>
-            <w:pPr>
-              <w:spacing w:after="0"/>
-              <w:jc w:val="left"/>
-            </w:pPr>
-            <w:r>
-              <w:rPr>
-                <w:rFonts w:ascii="Yu Gothic" w:eastAsia="Yu Gothic" w:hAnsi="Yu Gothic"/>
-                <w:sz w:val="19"/>
-                <w:szCs w:val="19"/>
-              </w:rPr>
-              <w:t xml:space="preserve">介護費用の目安の考え方、介護休業・公的制度の使い方</w:t>
-            </w:r>
-          </w:p>
-        </w:tc>
-        <w:tc>
-          <w:tcPr>
-            <w:tcW w:type="dxa" w:w="2100"/>
-            <w:tcBorders>
-              <w:top w:val="single" w:color="BFBFBF" w:sz="4"/>
-              <w:left w:val="single" w:color="BFBFBF" w:sz="4"/>
-              <w:bottom w:val="single" w:color="BFBFBF" w:sz="4"/>
-              <w:right w:val="single" w:color="BFBFBF" w:sz="4"/>
-            </w:tcBorders>
             <w:tcMar>
               <w:top w:type="dxa" w:w="50"/>
               <w:left w:type="dxa" w:w="100"/>
@@ -1217,7 +1085,7 @@
                 <w:sz w:val="19"/>
                 <w:szCs w:val="19"/>
               </w:rPr>
-              <w:t xml:space="preserve">受講者用レジュメ、研修記録用の実施報告書（施設控え）</w:t>
+              <w:t xml:space="preserve">受講者用レジュメ、実施報告書（施設控え）</w:t>
             </w:r>
           </w:p>
         </w:tc>

</xml_diff>

<commit_message>
Remove facility benefits section from proposal
Co-Authored-By: Claude Opus 5.5 <noreply@anthropic.com>
Claude-Session: https://claude.ai/code/session_01ASU6ETCN5Sbt1bh9wzP5YS
</commit_message>
<xml_diff>
--- a/勉強会提案書_結いのこころ.docx
+++ b/勉強会提案書_結いのこころ.docx
@@ -142,138 +142,6 @@
           <w:szCs w:val="19"/>
         </w:rPr>
         <w:t xml:space="preserve">をご提案いたします。</w:t>
-      </w:r>
-    </w:p>
-    <w:p>
-      <w:pPr>
-        <w:pBdr>
-          <w:bottom w:val="single" w:color="BFBFBF" w:sz="4" w:space="2"/>
-          <w:left w:val="single" w:color="1F4E79" w:sz="24" w:space="6"/>
-        </w:pBdr>
-        <w:spacing w:after="50" w:before="100"/>
-      </w:pPr>
-      <w:r>
-        <w:rPr>
-          <w:rFonts w:ascii="Yu Gothic" w:eastAsia="Yu Gothic" w:hAnsi="Yu Gothic"/>
-          <w:b/>
-          <w:bCs/>
-          <w:color w:val="1F4E79"/>
-          <w:sz w:val="22"/>
-          <w:szCs w:val="22"/>
-        </w:rPr>
-        <w:t xml:space="preserve">施設さまのメリット</w:t>
-      </w:r>
-    </w:p>
-    <w:p>
-      <w:pPr>
-        <w:pStyle w:val="ListParagraph"/>
-        <w:numPr>
-          <w:ilvl w:val="0"/>
-          <w:numId w:val="2"/>
-        </w:numPr>
-        <w:spacing w:after="20" w:line="264"/>
-      </w:pPr>
-      <w:r>
-        <w:rPr>
-          <w:rFonts w:ascii="Yu Gothic" w:eastAsia="Yu Gothic" w:hAnsi="Yu Gothic"/>
-          <w:b/>
-          <w:bCs/>
-          <w:sz w:val="19"/>
-          <w:szCs w:val="19"/>
-        </w:rPr>
-        <w:t xml:space="preserve">職員研修の機会として活用可能：</w:t>
-      </w:r>
-      <w:r>
-        <w:rPr>
-          <w:rFonts w:ascii="Yu Gothic" w:eastAsia="Yu Gothic" w:hAnsi="Yu Gothic"/>
-          <w:sz w:val="19"/>
-          <w:szCs w:val="19"/>
-        </w:rPr>
-        <w:t xml:space="preserve">外部講師による研修として、研修計画や記録にも組み込めます</w:t>
-      </w:r>
-    </w:p>
-    <w:p>
-      <w:pPr>
-        <w:pStyle w:val="ListParagraph"/>
-        <w:numPr>
-          <w:ilvl w:val="0"/>
-          <w:numId w:val="2"/>
-        </w:numPr>
-        <w:spacing w:after="20" w:line="264"/>
-      </w:pPr>
-      <w:r>
-        <w:rPr>
-          <w:rFonts w:ascii="Yu Gothic" w:eastAsia="Yu Gothic" w:hAnsi="Yu Gothic"/>
-          <w:b/>
-          <w:bCs/>
-          <w:sz w:val="19"/>
-          <w:szCs w:val="19"/>
-        </w:rPr>
-        <w:t xml:space="preserve">職員の定着支援：</w:t>
-      </w:r>
-      <w:r>
-        <w:rPr>
-          <w:rFonts w:ascii="Yu Gothic" w:eastAsia="Yu Gothic" w:hAnsi="Yu Gothic"/>
-          <w:sz w:val="19"/>
-          <w:szCs w:val="19"/>
-        </w:rPr>
-        <w:t xml:space="preserve">お金や社会保障の不安を減らすことが、福利厚生の充実につながります</w:t>
-      </w:r>
-    </w:p>
-    <w:p>
-      <w:pPr>
-        <w:pStyle w:val="ListParagraph"/>
-        <w:numPr>
-          <w:ilvl w:val="0"/>
-          <w:numId w:val="2"/>
-        </w:numPr>
-        <w:spacing w:after="20" w:line="264"/>
-      </w:pPr>
-      <w:r>
-        <w:rPr>
-          <w:rFonts w:ascii="Yu Gothic" w:eastAsia="Yu Gothic" w:hAnsi="Yu Gothic"/>
-          <w:b/>
-          <w:bCs/>
-          <w:sz w:val="19"/>
-          <w:szCs w:val="19"/>
-        </w:rPr>
-        <w:t xml:space="preserve">利用者・ご家族対応の質向上：</w:t>
-      </w:r>
-      <w:r>
-        <w:rPr>
-          <w:rFonts w:ascii="Yu Gothic" w:eastAsia="Yu Gothic" w:hAnsi="Yu Gothic"/>
-          <w:sz w:val="19"/>
-          <w:szCs w:val="19"/>
-        </w:rPr>
-        <w:t xml:space="preserve">介護費用や認知症とお金の基礎知識を、ご家族からの相談に生かせます</w:t>
-      </w:r>
-    </w:p>
-    <w:p>
-      <w:pPr>
-        <w:pStyle w:val="ListParagraph"/>
-        <w:numPr>
-          <w:ilvl w:val="0"/>
-          <w:numId w:val="2"/>
-        </w:numPr>
-        <w:spacing w:after="20" w:line="264"/>
-      </w:pPr>
-      <w:r>
-        <w:rPr>
-          <w:rFonts w:ascii="Yu Gothic" w:eastAsia="Yu Gothic" w:hAnsi="Yu Gothic"/>
-          <w:b/>
-          <w:bCs/>
-          <w:sz w:val="19"/>
-          <w:szCs w:val="19"/>
-        </w:rPr>
-        <w:t xml:space="preserve">準備の負担なし：</w:t>
-      </w:r>
-      <w:r>
-        <w:rPr>
-          <w:rFonts w:ascii="Yu Gothic" w:eastAsia="Yu Gothic" w:hAnsi="Yu Gothic"/>
-          <w:sz w:val="19"/>
-          <w:szCs w:val="19"/>
-        </w:rPr>
-        <w:t xml:space="preserve">資料・進行はすべてこちらで用意します</w:t>
       </w:r>
     </w:p>
     <w:p>

</xml_diff>

<commit_message>
Expand proposal themes to five
Co-Authored-By: Claude Opus 5.5 <noreply@anthropic.com>
Claude-Session: https://claude.ai/code/session_01ASU6ETCN5Sbt1bh9wzP5YS
</commit_message>
<xml_diff>
--- a/勉強会提案書_結いのこころ.docx
+++ b/勉強会提案書_結いのこころ.docx
@@ -429,7 +429,7 @@
                 <w:sz w:val="19"/>
                 <w:szCs w:val="19"/>
               </w:rPr>
-              <w:t xml:space="preserve">給与明細と社会保険、NISA・iDeCoの基本、もしもの時の公的保障</w:t>
+              <w:t xml:space="preserve">給与明細と社会保険の見方、NISA・iDeCoの基本</w:t>
             </w:r>
           </w:p>
         </w:tc>
@@ -530,7 +530,7 @@
                 <w:sz w:val="19"/>
                 <w:szCs w:val="19"/>
               </w:rPr>
-              <w:t xml:space="preserve">認知症と家族のお金</w:t>
+              <w:t xml:space="preserve">病気やケガで働けなくなったときのお金</w:t>
             </w:r>
           </w:p>
         </w:tc>
@@ -562,7 +562,7 @@
                 <w:sz w:val="19"/>
                 <w:szCs w:val="19"/>
               </w:rPr>
-              <w:t xml:space="preserve">資産凍結の仕組み、成年後見・任意後見・家族信託の違い</w:t>
+              <w:t xml:space="preserve">高額療養費・傷病手当金・障害年金など公的保障と、足りない分の備え方</w:t>
             </w:r>
           </w:p>
         </w:tc>
@@ -594,7 +594,7 @@
                 <w:sz w:val="19"/>
                 <w:szCs w:val="19"/>
               </w:rPr>
-              <w:t xml:space="preserve">相談員・ケアマネジャー</w:t>
+              <w:t xml:space="preserve">全職員</w:t>
             </w:r>
           </w:p>
         </w:tc>
@@ -630,6 +630,274 @@
                 <w:szCs w:val="19"/>
               </w:rPr>
               <w:t xml:space="preserve">3</w:t>
+            </w:r>
+          </w:p>
+        </w:tc>
+        <w:tc>
+          <w:tcPr>
+            <w:tcW w:type="dxa" w:w="3300"/>
+            <w:tcBorders>
+              <w:top w:val="single" w:color="BFBFBF" w:sz="4"/>
+              <w:left w:val="single" w:color="BFBFBF" w:sz="4"/>
+              <w:bottom w:val="single" w:color="BFBFBF" w:sz="4"/>
+              <w:right w:val="single" w:color="BFBFBF" w:sz="4"/>
+            </w:tcBorders>
+            <w:shd w:fill="F2F7FC" w:color="auto" w:val="clear"/>
+            <w:tcMar>
+              <w:top w:type="dxa" w:w="50"/>
+              <w:left w:type="dxa" w:w="100"/>
+              <w:bottom w:type="dxa" w:w="50"/>
+              <w:right w:type="dxa" w:w="100"/>
+            </w:tcMar>
+            <w:vAlign w:val="center"/>
+          </w:tcPr>
+          <w:p>
+            <w:pPr>
+              <w:spacing w:after="0"/>
+              <w:jc w:val="left"/>
+            </w:pPr>
+            <w:r>
+              <w:rPr>
+                <w:rFonts w:ascii="Yu Gothic" w:eastAsia="Yu Gothic" w:hAnsi="Yu Gothic"/>
+                <w:b/>
+                <w:bCs/>
+                <w:sz w:val="19"/>
+                <w:szCs w:val="19"/>
+              </w:rPr>
+              <w:t xml:space="preserve">ねんきん定期便の見方と老後のお金</w:t>
+            </w:r>
+          </w:p>
+        </w:tc>
+        <w:tc>
+          <w:tcPr>
+            <w:tcW w:type="dxa" w:w="4206"/>
+            <w:tcBorders>
+              <w:top w:val="single" w:color="BFBFBF" w:sz="4"/>
+              <w:left w:val="single" w:color="BFBFBF" w:sz="4"/>
+              <w:bottom w:val="single" w:color="BFBFBF" w:sz="4"/>
+              <w:right w:val="single" w:color="BFBFBF" w:sz="4"/>
+            </w:tcBorders>
+            <w:shd w:fill="F2F7FC" w:color="auto" w:val="clear"/>
+            <w:tcMar>
+              <w:top w:type="dxa" w:w="50"/>
+              <w:left w:type="dxa" w:w="100"/>
+              <w:bottom w:type="dxa" w:w="50"/>
+              <w:right w:type="dxa" w:w="100"/>
+            </w:tcMar>
+            <w:vAlign w:val="center"/>
+          </w:tcPr>
+          <w:p>
+            <w:pPr>
+              <w:spacing w:after="0"/>
+              <w:jc w:val="left"/>
+            </w:pPr>
+            <w:r>
+              <w:rPr>
+                <w:rFonts w:ascii="Yu Gothic" w:eastAsia="Yu Gothic" w:hAnsi="Yu Gothic"/>
+                <w:sz w:val="19"/>
+                <w:szCs w:val="19"/>
+              </w:rPr>
+              <w:t xml:space="preserve">年金の受け取り見込みの確認、老後に必要なお金の考え方</w:t>
+            </w:r>
+          </w:p>
+        </w:tc>
+        <w:tc>
+          <w:tcPr>
+            <w:tcW w:type="dxa" w:w="2100"/>
+            <w:tcBorders>
+              <w:top w:val="single" w:color="BFBFBF" w:sz="4"/>
+              <w:left w:val="single" w:color="BFBFBF" w:sz="4"/>
+              <w:bottom w:val="single" w:color="BFBFBF" w:sz="4"/>
+              <w:right w:val="single" w:color="BFBFBF" w:sz="4"/>
+            </w:tcBorders>
+            <w:shd w:fill="F2F7FC" w:color="auto" w:val="clear"/>
+            <w:tcMar>
+              <w:top w:type="dxa" w:w="50"/>
+              <w:left w:type="dxa" w:w="100"/>
+              <w:bottom w:type="dxa" w:w="50"/>
+              <w:right w:type="dxa" w:w="100"/>
+            </w:tcMar>
+            <w:vAlign w:val="center"/>
+          </w:tcPr>
+          <w:p>
+            <w:pPr>
+              <w:spacing w:after="0"/>
+              <w:jc w:val="left"/>
+            </w:pPr>
+            <w:r>
+              <w:rPr>
+                <w:rFonts w:ascii="Yu Gothic" w:eastAsia="Yu Gothic" w:hAnsi="Yu Gothic"/>
+                <w:sz w:val="19"/>
+                <w:szCs w:val="19"/>
+              </w:rPr>
+              <w:t xml:space="preserve">全職員（特に40代以上）</w:t>
+            </w:r>
+          </w:p>
+        </w:tc>
+      </w:tr>
+      <w:tr>
+        <w:tc>
+          <w:tcPr>
+            <w:tcW w:type="dxa" w:w="600"/>
+            <w:tcBorders>
+              <w:top w:val="single" w:color="BFBFBF" w:sz="4"/>
+              <w:left w:val="single" w:color="BFBFBF" w:sz="4"/>
+              <w:bottom w:val="single" w:color="BFBFBF" w:sz="4"/>
+              <w:right w:val="single" w:color="BFBFBF" w:sz="4"/>
+            </w:tcBorders>
+            <w:tcMar>
+              <w:top w:type="dxa" w:w="50"/>
+              <w:left w:type="dxa" w:w="100"/>
+              <w:bottom w:type="dxa" w:w="50"/>
+              <w:right w:type="dxa" w:w="100"/>
+            </w:tcMar>
+            <w:vAlign w:val="center"/>
+          </w:tcPr>
+          <w:p>
+            <w:pPr>
+              <w:spacing w:after="0"/>
+              <w:jc w:val="center"/>
+            </w:pPr>
+            <w:r>
+              <w:rPr>
+                <w:rFonts w:ascii="Yu Gothic" w:eastAsia="Yu Gothic" w:hAnsi="Yu Gothic"/>
+                <w:sz w:val="19"/>
+                <w:szCs w:val="19"/>
+              </w:rPr>
+              <w:t xml:space="preserve">4</w:t>
+            </w:r>
+          </w:p>
+        </w:tc>
+        <w:tc>
+          <w:tcPr>
+            <w:tcW w:type="dxa" w:w="3300"/>
+            <w:tcBorders>
+              <w:top w:val="single" w:color="BFBFBF" w:sz="4"/>
+              <w:left w:val="single" w:color="BFBFBF" w:sz="4"/>
+              <w:bottom w:val="single" w:color="BFBFBF" w:sz="4"/>
+              <w:right w:val="single" w:color="BFBFBF" w:sz="4"/>
+            </w:tcBorders>
+            <w:tcMar>
+              <w:top w:type="dxa" w:w="50"/>
+              <w:left w:type="dxa" w:w="100"/>
+              <w:bottom w:type="dxa" w:w="50"/>
+              <w:right w:type="dxa" w:w="100"/>
+            </w:tcMar>
+            <w:vAlign w:val="center"/>
+          </w:tcPr>
+          <w:p>
+            <w:pPr>
+              <w:spacing w:after="0"/>
+              <w:jc w:val="left"/>
+            </w:pPr>
+            <w:r>
+              <w:rPr>
+                <w:rFonts w:ascii="Yu Gothic" w:eastAsia="Yu Gothic" w:hAnsi="Yu Gothic"/>
+                <w:b/>
+                <w:bCs/>
+                <w:sz w:val="19"/>
+                <w:szCs w:val="19"/>
+              </w:rPr>
+              <w:t xml:space="preserve">認知症と家族のお金</w:t>
+            </w:r>
+          </w:p>
+        </w:tc>
+        <w:tc>
+          <w:tcPr>
+            <w:tcW w:type="dxa" w:w="4206"/>
+            <w:tcBorders>
+              <w:top w:val="single" w:color="BFBFBF" w:sz="4"/>
+              <w:left w:val="single" w:color="BFBFBF" w:sz="4"/>
+              <w:bottom w:val="single" w:color="BFBFBF" w:sz="4"/>
+              <w:right w:val="single" w:color="BFBFBF" w:sz="4"/>
+            </w:tcBorders>
+            <w:tcMar>
+              <w:top w:type="dxa" w:w="50"/>
+              <w:left w:type="dxa" w:w="100"/>
+              <w:bottom w:type="dxa" w:w="50"/>
+              <w:right w:type="dxa" w:w="100"/>
+            </w:tcMar>
+            <w:vAlign w:val="center"/>
+          </w:tcPr>
+          <w:p>
+            <w:pPr>
+              <w:spacing w:after="0"/>
+              <w:jc w:val="left"/>
+            </w:pPr>
+            <w:r>
+              <w:rPr>
+                <w:rFonts w:ascii="Yu Gothic" w:eastAsia="Yu Gothic" w:hAnsi="Yu Gothic"/>
+                <w:sz w:val="19"/>
+                <w:szCs w:val="19"/>
+              </w:rPr>
+              <w:t xml:space="preserve">資産凍結の仕組み、成年後見・任意後見・家族信託の違い</w:t>
+            </w:r>
+          </w:p>
+        </w:tc>
+        <w:tc>
+          <w:tcPr>
+            <w:tcW w:type="dxa" w:w="2100"/>
+            <w:tcBorders>
+              <w:top w:val="single" w:color="BFBFBF" w:sz="4"/>
+              <w:left w:val="single" w:color="BFBFBF" w:sz="4"/>
+              <w:bottom w:val="single" w:color="BFBFBF" w:sz="4"/>
+              <w:right w:val="single" w:color="BFBFBF" w:sz="4"/>
+            </w:tcBorders>
+            <w:tcMar>
+              <w:top w:type="dxa" w:w="50"/>
+              <w:left w:type="dxa" w:w="100"/>
+              <w:bottom w:type="dxa" w:w="50"/>
+              <w:right w:type="dxa" w:w="100"/>
+            </w:tcMar>
+            <w:vAlign w:val="center"/>
+          </w:tcPr>
+          <w:p>
+            <w:pPr>
+              <w:spacing w:after="0"/>
+              <w:jc w:val="left"/>
+            </w:pPr>
+            <w:r>
+              <w:rPr>
+                <w:rFonts w:ascii="Yu Gothic" w:eastAsia="Yu Gothic" w:hAnsi="Yu Gothic"/>
+                <w:sz w:val="19"/>
+                <w:szCs w:val="19"/>
+              </w:rPr>
+              <w:t xml:space="preserve">相談員・ケアマネジャー</w:t>
+            </w:r>
+          </w:p>
+        </w:tc>
+      </w:tr>
+      <w:tr>
+        <w:tc>
+          <w:tcPr>
+            <w:tcW w:type="dxa" w:w="600"/>
+            <w:tcBorders>
+              <w:top w:val="single" w:color="BFBFBF" w:sz="4"/>
+              <w:left w:val="single" w:color="BFBFBF" w:sz="4"/>
+              <w:bottom w:val="single" w:color="BFBFBF" w:sz="4"/>
+              <w:right w:val="single" w:color="BFBFBF" w:sz="4"/>
+            </w:tcBorders>
+            <w:shd w:fill="F2F7FC" w:color="auto" w:val="clear"/>
+            <w:tcMar>
+              <w:top w:type="dxa" w:w="50"/>
+              <w:left w:type="dxa" w:w="100"/>
+              <w:bottom w:type="dxa" w:w="50"/>
+              <w:right w:type="dxa" w:w="100"/>
+            </w:tcMar>
+            <w:vAlign w:val="center"/>
+          </w:tcPr>
+          <w:p>
+            <w:pPr>
+              <w:spacing w:after="0"/>
+              <w:jc w:val="center"/>
+            </w:pPr>
+            <w:r>
+              <w:rPr>
+                <w:rFonts w:ascii="Yu Gothic" w:eastAsia="Yu Gothic" w:hAnsi="Yu Gothic"/>
+                <w:sz w:val="19"/>
+                <w:szCs w:val="19"/>
+              </w:rPr>
+              <w:t xml:space="preserve">5</w:t>
             </w:r>
           </w:p>
         </w:tc>

</xml_diff>

<commit_message>
Add FSA report advisor context to proposal purpose
Co-Authored-By: Claude Opus 5.5 <noreply@anthropic.com>
Claude-Session: https://claude.ai/code/session_01ASU6ETCN5Sbt1bh9wzP5YS
</commit_message>
<xml_diff>
--- a/勉強会提案書_結いのこころ.docx
+++ b/勉強会提案書_結いのこころ.docx
@@ -122,7 +122,33 @@
           <w:sz w:val="19"/>
           <w:szCs w:val="19"/>
         </w:rPr>
-        <w:t xml:space="preserve">介護の現場では、利用者さまを支える職員の皆さまご自身の生活基盤の安定が、より良いケアと職員の定着の土台になります。医療・介護の現場経験とFPの知見を生かし、職員会議などの時間を使った</w:t>
+        <w:t xml:space="preserve">介護の現場では、利用者さまを支える職員の皆さまご自身の生活基盤の安定が、より良いケアと職員の定着の土台になります。</w:t>
+      </w:r>
+    </w:p>
+    <w:p>
+      <w:pPr>
+        <w:spacing w:after="40" w:line="276"/>
+      </w:pPr>
+      <w:r>
+        <w:rPr>
+          <w:rFonts w:ascii="Yu Gothic" w:eastAsia="Yu Gothic" w:hAnsi="Yu Gothic"/>
+          <w:sz w:val="19"/>
+          <w:szCs w:val="19"/>
+        </w:rPr>
+        <w:t xml:space="preserve">長寿化が進むなか、金融庁 金融審議会の報告書「高齢社会における資産形成・管理」（2019年）でも、ライフステージに応じて早めに資産形成・管理を考えることの大切さとともに、顧客の立場に立って幅広い相談に応じるアドバイザーの充実が求められています。</w:t>
+      </w:r>
+    </w:p>
+    <w:p>
+      <w:pPr>
+        <w:spacing w:after="40" w:line="276"/>
+      </w:pPr>
+      <w:r>
+        <w:rPr>
+          <w:rFonts w:ascii="Yu Gothic" w:eastAsia="Yu Gothic" w:hAnsi="Yu Gothic"/>
+          <w:sz w:val="19"/>
+          <w:szCs w:val="19"/>
+        </w:rPr>
+        <w:t xml:space="preserve">医療・介護の現場経験とFPの知見を生かし、職員の皆さまの身近な相談役として、職員会議などの時間を使った</w:t>
       </w:r>
       <w:r>
         <w:rPr>
@@ -197,9 +223,9 @@
             </w:tcBorders>
             <w:shd w:fill="1F4E79" w:color="auto" w:val="clear"/>
             <w:tcMar>
-              <w:top w:type="dxa" w:w="50"/>
-              <w:left w:type="dxa" w:w="100"/>
-              <w:bottom w:type="dxa" w:w="50"/>
+              <w:top w:type="dxa" w:w="30"/>
+              <w:left w:type="dxa" w:w="100"/>
+              <w:bottom w:type="dxa" w:w="30"/>
               <w:right w:type="dxa" w:w="100"/>
             </w:tcMar>
             <w:vAlign w:val="center"/>
@@ -233,9 +259,9 @@
             </w:tcBorders>
             <w:shd w:fill="1F4E79" w:color="auto" w:val="clear"/>
             <w:tcMar>
-              <w:top w:type="dxa" w:w="50"/>
-              <w:left w:type="dxa" w:w="100"/>
-              <w:bottom w:type="dxa" w:w="50"/>
+              <w:top w:type="dxa" w:w="30"/>
+              <w:left w:type="dxa" w:w="100"/>
+              <w:bottom w:type="dxa" w:w="30"/>
               <w:right w:type="dxa" w:w="100"/>
             </w:tcMar>
             <w:vAlign w:val="center"/>
@@ -269,9 +295,9 @@
             </w:tcBorders>
             <w:shd w:fill="1F4E79" w:color="auto" w:val="clear"/>
             <w:tcMar>
-              <w:top w:type="dxa" w:w="50"/>
-              <w:left w:type="dxa" w:w="100"/>
-              <w:bottom w:type="dxa" w:w="50"/>
+              <w:top w:type="dxa" w:w="30"/>
+              <w:left w:type="dxa" w:w="100"/>
+              <w:bottom w:type="dxa" w:w="30"/>
               <w:right w:type="dxa" w:w="100"/>
             </w:tcMar>
             <w:vAlign w:val="center"/>
@@ -305,9 +331,9 @@
             </w:tcBorders>
             <w:shd w:fill="1F4E79" w:color="auto" w:val="clear"/>
             <w:tcMar>
-              <w:top w:type="dxa" w:w="50"/>
-              <w:left w:type="dxa" w:w="100"/>
-              <w:bottom w:type="dxa" w:w="50"/>
+              <w:top w:type="dxa" w:w="30"/>
+              <w:left w:type="dxa" w:w="100"/>
+              <w:bottom w:type="dxa" w:w="30"/>
               <w:right w:type="dxa" w:w="100"/>
             </w:tcMar>
             <w:vAlign w:val="center"/>
@@ -343,9 +369,9 @@
             </w:tcBorders>
             <w:shd w:fill="F2F7FC" w:color="auto" w:val="clear"/>
             <w:tcMar>
-              <w:top w:type="dxa" w:w="50"/>
-              <w:left w:type="dxa" w:w="100"/>
-              <w:bottom w:type="dxa" w:w="50"/>
+              <w:top w:type="dxa" w:w="30"/>
+              <w:left w:type="dxa" w:w="100"/>
+              <w:bottom w:type="dxa" w:w="30"/>
               <w:right w:type="dxa" w:w="100"/>
             </w:tcMar>
             <w:vAlign w:val="center"/>
@@ -376,9 +402,9 @@
             </w:tcBorders>
             <w:shd w:fill="F2F7FC" w:color="auto" w:val="clear"/>
             <w:tcMar>
-              <w:top w:type="dxa" w:w="50"/>
-              <w:left w:type="dxa" w:w="100"/>
-              <w:bottom w:type="dxa" w:w="50"/>
+              <w:top w:type="dxa" w:w="30"/>
+              <w:left w:type="dxa" w:w="100"/>
+              <w:bottom w:type="dxa" w:w="30"/>
               <w:right w:type="dxa" w:w="100"/>
             </w:tcMar>
             <w:vAlign w:val="center"/>
@@ -411,9 +437,9 @@
             </w:tcBorders>
             <w:shd w:fill="F2F7FC" w:color="auto" w:val="clear"/>
             <w:tcMar>
-              <w:top w:type="dxa" w:w="50"/>
-              <w:left w:type="dxa" w:w="100"/>
-              <w:bottom w:type="dxa" w:w="50"/>
+              <w:top w:type="dxa" w:w="30"/>
+              <w:left w:type="dxa" w:w="100"/>
+              <w:bottom w:type="dxa" w:w="30"/>
               <w:right w:type="dxa" w:w="100"/>
             </w:tcMar>
             <w:vAlign w:val="center"/>
@@ -444,9 +470,9 @@
             </w:tcBorders>
             <w:shd w:fill="F2F7FC" w:color="auto" w:val="clear"/>
             <w:tcMar>
-              <w:top w:type="dxa" w:w="50"/>
-              <w:left w:type="dxa" w:w="100"/>
-              <w:bottom w:type="dxa" w:w="50"/>
+              <w:top w:type="dxa" w:w="30"/>
+              <w:left w:type="dxa" w:w="100"/>
+              <w:bottom w:type="dxa" w:w="30"/>
               <w:right w:type="dxa" w:w="100"/>
             </w:tcMar>
             <w:vAlign w:val="center"/>
@@ -478,9 +504,9 @@
               <w:right w:val="single" w:color="BFBFBF" w:sz="4"/>
             </w:tcBorders>
             <w:tcMar>
-              <w:top w:type="dxa" w:w="50"/>
-              <w:left w:type="dxa" w:w="100"/>
-              <w:bottom w:type="dxa" w:w="50"/>
+              <w:top w:type="dxa" w:w="30"/>
+              <w:left w:type="dxa" w:w="100"/>
+              <w:bottom w:type="dxa" w:w="30"/>
               <w:right w:type="dxa" w:w="100"/>
             </w:tcMar>
             <w:vAlign w:val="center"/>
@@ -510,9 +536,9 @@
               <w:right w:val="single" w:color="BFBFBF" w:sz="4"/>
             </w:tcBorders>
             <w:tcMar>
-              <w:top w:type="dxa" w:w="50"/>
-              <w:left w:type="dxa" w:w="100"/>
-              <w:bottom w:type="dxa" w:w="50"/>
+              <w:top w:type="dxa" w:w="30"/>
+              <w:left w:type="dxa" w:w="100"/>
+              <w:bottom w:type="dxa" w:w="30"/>
               <w:right w:type="dxa" w:w="100"/>
             </w:tcMar>
             <w:vAlign w:val="center"/>
@@ -544,9 +570,9 @@
               <w:right w:val="single" w:color="BFBFBF" w:sz="4"/>
             </w:tcBorders>
             <w:tcMar>
-              <w:top w:type="dxa" w:w="50"/>
-              <w:left w:type="dxa" w:w="100"/>
-              <w:bottom w:type="dxa" w:w="50"/>
+              <w:top w:type="dxa" w:w="30"/>
+              <w:left w:type="dxa" w:w="100"/>
+              <w:bottom w:type="dxa" w:w="30"/>
               <w:right w:type="dxa" w:w="100"/>
             </w:tcMar>
             <w:vAlign w:val="center"/>
@@ -576,9 +602,9 @@
               <w:right w:val="single" w:color="BFBFBF" w:sz="4"/>
             </w:tcBorders>
             <w:tcMar>
-              <w:top w:type="dxa" w:w="50"/>
-              <w:left w:type="dxa" w:w="100"/>
-              <w:bottom w:type="dxa" w:w="50"/>
+              <w:top w:type="dxa" w:w="30"/>
+              <w:left w:type="dxa" w:w="100"/>
+              <w:bottom w:type="dxa" w:w="30"/>
               <w:right w:type="dxa" w:w="100"/>
             </w:tcMar>
             <w:vAlign w:val="center"/>
@@ -611,9 +637,9 @@
             </w:tcBorders>
             <w:shd w:fill="F2F7FC" w:color="auto" w:val="clear"/>
             <w:tcMar>
-              <w:top w:type="dxa" w:w="50"/>
-              <w:left w:type="dxa" w:w="100"/>
-              <w:bottom w:type="dxa" w:w="50"/>
+              <w:top w:type="dxa" w:w="30"/>
+              <w:left w:type="dxa" w:w="100"/>
+              <w:bottom w:type="dxa" w:w="30"/>
               <w:right w:type="dxa" w:w="100"/>
             </w:tcMar>
             <w:vAlign w:val="center"/>
@@ -644,9 +670,9 @@
             </w:tcBorders>
             <w:shd w:fill="F2F7FC" w:color="auto" w:val="clear"/>
             <w:tcMar>
-              <w:top w:type="dxa" w:w="50"/>
-              <w:left w:type="dxa" w:w="100"/>
-              <w:bottom w:type="dxa" w:w="50"/>
+              <w:top w:type="dxa" w:w="30"/>
+              <w:left w:type="dxa" w:w="100"/>
+              <w:bottom w:type="dxa" w:w="30"/>
               <w:right w:type="dxa" w:w="100"/>
             </w:tcMar>
             <w:vAlign w:val="center"/>
@@ -679,9 +705,9 @@
             </w:tcBorders>
             <w:shd w:fill="F2F7FC" w:color="auto" w:val="clear"/>
             <w:tcMar>
-              <w:top w:type="dxa" w:w="50"/>
-              <w:left w:type="dxa" w:w="100"/>
-              <w:bottom w:type="dxa" w:w="50"/>
+              <w:top w:type="dxa" w:w="30"/>
+              <w:left w:type="dxa" w:w="100"/>
+              <w:bottom w:type="dxa" w:w="30"/>
               <w:right w:type="dxa" w:w="100"/>
             </w:tcMar>
             <w:vAlign w:val="center"/>
@@ -712,9 +738,9 @@
             </w:tcBorders>
             <w:shd w:fill="F2F7FC" w:color="auto" w:val="clear"/>
             <w:tcMar>
-              <w:top w:type="dxa" w:w="50"/>
-              <w:left w:type="dxa" w:w="100"/>
-              <w:bottom w:type="dxa" w:w="50"/>
+              <w:top w:type="dxa" w:w="30"/>
+              <w:left w:type="dxa" w:w="100"/>
+              <w:bottom w:type="dxa" w:w="30"/>
               <w:right w:type="dxa" w:w="100"/>
             </w:tcMar>
             <w:vAlign w:val="center"/>
@@ -746,9 +772,9 @@
               <w:right w:val="single" w:color="BFBFBF" w:sz="4"/>
             </w:tcBorders>
             <w:tcMar>
-              <w:top w:type="dxa" w:w="50"/>
-              <w:left w:type="dxa" w:w="100"/>
-              <w:bottom w:type="dxa" w:w="50"/>
+              <w:top w:type="dxa" w:w="30"/>
+              <w:left w:type="dxa" w:w="100"/>
+              <w:bottom w:type="dxa" w:w="30"/>
               <w:right w:type="dxa" w:w="100"/>
             </w:tcMar>
             <w:vAlign w:val="center"/>
@@ -778,9 +804,9 @@
               <w:right w:val="single" w:color="BFBFBF" w:sz="4"/>
             </w:tcBorders>
             <w:tcMar>
-              <w:top w:type="dxa" w:w="50"/>
-              <w:left w:type="dxa" w:w="100"/>
-              <w:bottom w:type="dxa" w:w="50"/>
+              <w:top w:type="dxa" w:w="30"/>
+              <w:left w:type="dxa" w:w="100"/>
+              <w:bottom w:type="dxa" w:w="30"/>
               <w:right w:type="dxa" w:w="100"/>
             </w:tcMar>
             <w:vAlign w:val="center"/>
@@ -812,9 +838,9 @@
               <w:right w:val="single" w:color="BFBFBF" w:sz="4"/>
             </w:tcBorders>
             <w:tcMar>
-              <w:top w:type="dxa" w:w="50"/>
-              <w:left w:type="dxa" w:w="100"/>
-              <w:bottom w:type="dxa" w:w="50"/>
+              <w:top w:type="dxa" w:w="30"/>
+              <w:left w:type="dxa" w:w="100"/>
+              <w:bottom w:type="dxa" w:w="30"/>
               <w:right w:type="dxa" w:w="100"/>
             </w:tcMar>
             <w:vAlign w:val="center"/>
@@ -844,9 +870,9 @@
               <w:right w:val="single" w:color="BFBFBF" w:sz="4"/>
             </w:tcBorders>
             <w:tcMar>
-              <w:top w:type="dxa" w:w="50"/>
-              <w:left w:type="dxa" w:w="100"/>
-              <w:bottom w:type="dxa" w:w="50"/>
+              <w:top w:type="dxa" w:w="30"/>
+              <w:left w:type="dxa" w:w="100"/>
+              <w:bottom w:type="dxa" w:w="30"/>
               <w:right w:type="dxa" w:w="100"/>
             </w:tcMar>
             <w:vAlign w:val="center"/>
@@ -879,9 +905,9 @@
             </w:tcBorders>
             <w:shd w:fill="F2F7FC" w:color="auto" w:val="clear"/>
             <w:tcMar>
-              <w:top w:type="dxa" w:w="50"/>
-              <w:left w:type="dxa" w:w="100"/>
-              <w:bottom w:type="dxa" w:w="50"/>
+              <w:top w:type="dxa" w:w="30"/>
+              <w:left w:type="dxa" w:w="100"/>
+              <w:bottom w:type="dxa" w:w="30"/>
               <w:right w:type="dxa" w:w="100"/>
             </w:tcMar>
             <w:vAlign w:val="center"/>
@@ -912,9 +938,9 @@
             </w:tcBorders>
             <w:shd w:fill="F2F7FC" w:color="auto" w:val="clear"/>
             <w:tcMar>
-              <w:top w:type="dxa" w:w="50"/>
-              <w:left w:type="dxa" w:w="100"/>
-              <w:bottom w:type="dxa" w:w="50"/>
+              <w:top w:type="dxa" w:w="30"/>
+              <w:left w:type="dxa" w:w="100"/>
+              <w:bottom w:type="dxa" w:w="30"/>
               <w:right w:type="dxa" w:w="100"/>
             </w:tcMar>
             <w:vAlign w:val="center"/>
@@ -947,9 +973,9 @@
             </w:tcBorders>
             <w:shd w:fill="F2F7FC" w:color="auto" w:val="clear"/>
             <w:tcMar>
-              <w:top w:type="dxa" w:w="50"/>
-              <w:left w:type="dxa" w:w="100"/>
-              <w:bottom w:type="dxa" w:w="50"/>
+              <w:top w:type="dxa" w:w="30"/>
+              <w:left w:type="dxa" w:w="100"/>
+              <w:bottom w:type="dxa" w:w="30"/>
               <w:right w:type="dxa" w:w="100"/>
             </w:tcMar>
             <w:vAlign w:val="center"/>
@@ -980,9 +1006,9 @@
             </w:tcBorders>
             <w:shd w:fill="F2F7FC" w:color="auto" w:val="clear"/>
             <w:tcMar>
-              <w:top w:type="dxa" w:w="50"/>
-              <w:left w:type="dxa" w:w="100"/>
-              <w:bottom w:type="dxa" w:w="50"/>
+              <w:top w:type="dxa" w:w="30"/>
+              <w:left w:type="dxa" w:w="100"/>
+              <w:bottom w:type="dxa" w:w="30"/>
               <w:right w:type="dxa" w:w="100"/>
             </w:tcMar>
             <w:vAlign w:val="center"/>
@@ -1047,9 +1073,9 @@
             </w:tcBorders>
             <w:shd w:fill="FAFAFA" w:color="auto" w:val="clear"/>
             <w:tcMar>
-              <w:top w:type="dxa" w:w="80"/>
+              <w:top w:type="dxa" w:w="50"/>
               <w:left w:type="dxa" w:w="140"/>
-              <w:bottom w:type="dxa" w:w="80"/>
+              <w:bottom w:type="dxa" w:w="50"/>
               <w:right w:type="dxa" w:w="140"/>
             </w:tcMar>
           </w:tcPr>
@@ -1245,9 +1271,9 @@
             </w:tcBorders>
             <w:shd w:fill="FAFAFA" w:color="auto" w:val="clear"/>
             <w:tcMar>
-              <w:top w:type="dxa" w:w="80"/>
+              <w:top w:type="dxa" w:w="50"/>
               <w:left w:type="dxa" w:w="140"/>
-              <w:bottom w:type="dxa" w:w="80"/>
+              <w:bottom w:type="dxa" w:w="50"/>
               <w:right w:type="dxa" w:w="140"/>
             </w:tcMar>
           </w:tcPr>
@@ -1392,9 +1418,9 @@
             </w:tcBorders>
             <w:shd w:fill="F2F2F2" w:color="auto" w:val="clear"/>
             <w:tcMar>
-              <w:top w:type="dxa" w:w="40"/>
-              <w:left w:type="dxa" w:w="100"/>
-              <w:bottom w:type="dxa" w:w="40"/>
+              <w:top w:type="dxa" w:w="25"/>
+              <w:left w:type="dxa" w:w="100"/>
+              <w:bottom w:type="dxa" w:w="25"/>
               <w:right w:type="dxa" w:w="100"/>
             </w:tcMar>
             <w:vAlign w:val="center"/>
@@ -1427,9 +1453,9 @@
             </w:tcBorders>
             <w:shd w:fill="DEEAF6" w:color="auto" w:val="clear"/>
             <w:tcMar>
-              <w:top w:type="dxa" w:w="40"/>
-              <w:left w:type="dxa" w:w="100"/>
-              <w:bottom w:type="dxa" w:w="40"/>
+              <w:top w:type="dxa" w:w="25"/>
+              <w:left w:type="dxa" w:w="100"/>
+              <w:bottom w:type="dxa" w:w="25"/>
               <w:right w:type="dxa" w:w="100"/>
             </w:tcMar>
             <w:vAlign w:val="center"/>
@@ -1483,9 +1509,9 @@
               <w:right w:val="single" w:color="BFBFBF" w:sz="4"/>
             </w:tcBorders>
             <w:tcMar>
-              <w:top w:type="dxa" w:w="40"/>
-              <w:left w:type="dxa" w:w="100"/>
-              <w:bottom w:type="dxa" w:w="40"/>
+              <w:top w:type="dxa" w:w="25"/>
+              <w:left w:type="dxa" w:w="100"/>
+              <w:bottom w:type="dxa" w:w="25"/>
               <w:right w:type="dxa" w:w="100"/>
             </w:tcMar>
             <w:vAlign w:val="center"/>
@@ -1517,9 +1543,9 @@
               <w:right w:val="single" w:color="BFBFBF" w:sz="4"/>
             </w:tcBorders>
             <w:tcMar>
-              <w:top w:type="dxa" w:w="40"/>
-              <w:left w:type="dxa" w:w="100"/>
-              <w:bottom w:type="dxa" w:w="40"/>
+              <w:top w:type="dxa" w:w="25"/>
+              <w:left w:type="dxa" w:w="100"/>
+              <w:bottom w:type="dxa" w:w="25"/>
               <w:right w:type="dxa" w:w="100"/>
             </w:tcMar>
             <w:vAlign w:val="center"/>
@@ -1571,9 +1597,9 @@
               <w:right w:val="single" w:color="BFBFBF" w:sz="4"/>
             </w:tcBorders>
             <w:tcMar>
-              <w:top w:type="dxa" w:w="40"/>
-              <w:left w:type="dxa" w:w="100"/>
-              <w:bottom w:type="dxa" w:w="40"/>
+              <w:top w:type="dxa" w:w="25"/>
+              <w:left w:type="dxa" w:w="100"/>
+              <w:bottom w:type="dxa" w:w="25"/>
               <w:right w:type="dxa" w:w="100"/>
             </w:tcMar>
             <w:vAlign w:val="center"/>
@@ -1605,9 +1631,9 @@
               <w:right w:val="single" w:color="BFBFBF" w:sz="4"/>
             </w:tcBorders>
             <w:tcMar>
-              <w:top w:type="dxa" w:w="40"/>
-              <w:left w:type="dxa" w:w="100"/>
-              <w:bottom w:type="dxa" w:w="40"/>
+              <w:top w:type="dxa" w:w="25"/>
+              <w:left w:type="dxa" w:w="100"/>
+              <w:bottom w:type="dxa" w:w="25"/>
               <w:right w:type="dxa" w:w="100"/>
             </w:tcMar>
             <w:vAlign w:val="center"/>
@@ -1667,9 +1693,9 @@
               <w:right w:val="single" w:color="BFBFBF" w:sz="4"/>
             </w:tcBorders>
             <w:tcMar>
-              <w:top w:type="dxa" w:w="40"/>
-              <w:left w:type="dxa" w:w="100"/>
-              <w:bottom w:type="dxa" w:w="40"/>
+              <w:top w:type="dxa" w:w="25"/>
+              <w:left w:type="dxa" w:w="100"/>
+              <w:bottom w:type="dxa" w:w="25"/>
               <w:right w:type="dxa" w:w="100"/>
             </w:tcMar>
             <w:vAlign w:val="center"/>
@@ -1701,9 +1727,9 @@
               <w:right w:val="single" w:color="BFBFBF" w:sz="4"/>
             </w:tcBorders>
             <w:tcMar>
-              <w:top w:type="dxa" w:w="40"/>
-              <w:left w:type="dxa" w:w="100"/>
-              <w:bottom w:type="dxa" w:w="40"/>
+              <w:top w:type="dxa" w:w="25"/>
+              <w:left w:type="dxa" w:w="100"/>
+              <w:bottom w:type="dxa" w:w="25"/>
               <w:right w:type="dxa" w:w="100"/>
             </w:tcMar>
             <w:vAlign w:val="center"/>
@@ -1746,9 +1772,9 @@
               <w:right w:val="single" w:color="BFBFBF" w:sz="4"/>
             </w:tcBorders>
             <w:tcMar>
-              <w:top w:type="dxa" w:w="40"/>
-              <w:left w:type="dxa" w:w="100"/>
-              <w:bottom w:type="dxa" w:w="40"/>
+              <w:top w:type="dxa" w:w="25"/>
+              <w:left w:type="dxa" w:w="100"/>
+              <w:bottom w:type="dxa" w:w="25"/>
               <w:right w:type="dxa" w:w="100"/>
             </w:tcMar>
             <w:vAlign w:val="center"/>
@@ -1780,9 +1806,9 @@
               <w:right w:val="single" w:color="BFBFBF" w:sz="4"/>
             </w:tcBorders>
             <w:tcMar>
-              <w:top w:type="dxa" w:w="40"/>
-              <w:left w:type="dxa" w:w="100"/>
-              <w:bottom w:type="dxa" w:w="40"/>
+              <w:top w:type="dxa" w:w="25"/>
+              <w:left w:type="dxa" w:w="100"/>
+              <w:bottom w:type="dxa" w:w="25"/>
               <w:right w:type="dxa" w:w="100"/>
             </w:tcMar>
             <w:vAlign w:val="center"/>
@@ -1826,9 +1852,9 @@
               <w:right w:val="single" w:color="BFBFBF" w:sz="4"/>
             </w:tcBorders>
             <w:tcMar>
-              <w:top w:type="dxa" w:w="40"/>
-              <w:left w:type="dxa" w:w="100"/>
-              <w:bottom w:type="dxa" w:w="40"/>
+              <w:top w:type="dxa" w:w="25"/>
+              <w:left w:type="dxa" w:w="100"/>
+              <w:bottom w:type="dxa" w:w="25"/>
               <w:right w:type="dxa" w:w="100"/>
             </w:tcMar>
             <w:vAlign w:val="center"/>
@@ -1860,9 +1886,9 @@
               <w:right w:val="single" w:color="BFBFBF" w:sz="4"/>
             </w:tcBorders>
             <w:tcMar>
-              <w:top w:type="dxa" w:w="40"/>
-              <w:left w:type="dxa" w:w="100"/>
-              <w:bottom w:type="dxa" w:w="40"/>
+              <w:top w:type="dxa" w:w="25"/>
+              <w:left w:type="dxa" w:w="100"/>
+              <w:bottom w:type="dxa" w:w="25"/>
               <w:right w:type="dxa" w:w="100"/>
             </w:tcMar>
             <w:vAlign w:val="center"/>

</xml_diff>